<commit_message>
Fix stale Auto-Pay/DSR wording in README and UAT, and stale subscription-revenue reference in Excel Key_Insights (full-repo consistency audit)
</commit_message>
<xml_diff>
--- a/06_UAT_Test_Cases/BNPL_Command_Center_UAT_Test_Cases.docx
+++ b/06_UAT_Test_Cases/BNPL_Command_Center_UAT_Test_Cases.docx
@@ -608,7 +608,7 @@
           <w:sz w:val="21"/>
           <w:szCs w:val="21"/>
         </w:rPr>
-        <w:t xml:space="preserve">Credit screening (R-04): credit score &gt;= 600, Debt-Service Ratio &lt;= 50%, 3+ consecutive months of stable salary deposits.</w:t>
+        <w:t>Credit screening (R-04/R-05, tiered DSR decision layer): Full eligibility at credit score &gt;= 600 and DSR &lt;= 40%; Conditional eligibility (limited offer) at credit score &gt;= 650 and DSR 40-60%; otherwise Not Eligible. All tiers also require 3+ consecutive months of stable salary deposits.</w:t>
       </w:r>
     </w:p>
     <w:p>
@@ -7122,7 +7122,7 @@
                 <w:sz w:val="18"/>
                 <w:szCs w:val="18"/>
               </w:rPr>
-              <w:t xml:space="preserve">Credit score: 680 (&gt;= 600 default). DSR: 38% (&lt;= 50% default). Salary deposits: regular for the last 4 consecutive months (&gt;= 3 required).</w:t>
+              <w:t>Credit score: 680 (&gt;= 600 required for Full eligibility). DSR: 38% (&lt;= 40% -&gt; Full eligibility tier). Salary deposits: regular for the last 4 consecutive months (&gt;= 3 required).</w:t>
             </w:r>
           </w:p>
         </w:tc>
@@ -7546,7 +7546,7 @@
                 <w:sz w:val="18"/>
                 <w:szCs w:val="18"/>
               </w:rPr>
-              <w:t xml:space="preserve">Credit score: 540 (below 600 default). DSR: 62% (above 50% default).</w:t>
+              <w:t>Credit score: 540 (below 600 -- fails Full eligibility; also below 650 needed for Conditional). DSR: 62% (above 60% -- Not Eligible regardless of score).</w:t>
             </w:r>
           </w:p>
         </w:tc>

</xml_diff>